<commit_message>
ZIP imputing and Q8
-Imputed ZIP codes with mean imputation
-ZIPscratch contains KNN method of imputation and an attempt to visualize zip code distribution
-started adding some data for question 8
-Reordered the files
</commit_message>
<xml_diff>
--- a/AssignmentNotes.docx
+++ b/AssignmentNotes.docx
@@ -247,6 +247,157 @@
     <w:p>
       <w:pPr>
         <w:pStyle w:val="ListParagraph"/>
+        <w:spacing w:after="0"/>
+        <w:ind w:left="1440"/>
+        <w:rPr>
+          <w:b/>
+          <w:bCs/>
+        </w:rPr>
+      </w:pPr>
+      <w:r>
+        <w:rPr>
+          <w:b/>
+          <w:bCs/>
+        </w:rPr>
+        <w:t>Homeownership rates</w:t>
+      </w:r>
+      <w:r>
+        <w:rPr>
+          <w:b/>
+          <w:bCs/>
+        </w:rPr>
+        <w:t xml:space="preserve">, </w:t>
+      </w:r>
+    </w:p>
+    <w:p>
+      <w:pPr>
+        <w:pStyle w:val="ListParagraph"/>
+        <w:spacing w:after="0"/>
+        <w:ind w:left="1440"/>
+        <w:rPr>
+          <w:b/>
+          <w:bCs/>
+        </w:rPr>
+      </w:pPr>
+      <w:r>
+        <w:rPr>
+          <w:b/>
+          <w:bCs/>
+        </w:rPr>
+        <w:t xml:space="preserve">median rent equivalency, </w:t>
+      </w:r>
+    </w:p>
+    <w:p>
+      <w:pPr>
+        <w:pStyle w:val="ListParagraph"/>
+        <w:spacing w:after="0"/>
+        <w:ind w:left="1440"/>
+        <w:rPr>
+          <w:b/>
+          <w:bCs/>
+        </w:rPr>
+      </w:pPr>
+      <w:r>
+        <w:rPr>
+          <w:b/>
+          <w:bCs/>
+        </w:rPr>
+        <w:t xml:space="preserve">housing starts, </w:t>
+      </w:r>
+    </w:p>
+    <w:p>
+      <w:pPr>
+        <w:pStyle w:val="ListParagraph"/>
+        <w:spacing w:after="0"/>
+        <w:ind w:left="1440"/>
+        <w:rPr>
+          <w:b/>
+          <w:bCs/>
+        </w:rPr>
+      </w:pPr>
+      <w:r>
+        <w:rPr>
+          <w:b/>
+          <w:bCs/>
+        </w:rPr>
+        <w:t>unemployment rate,</w:t>
+      </w:r>
+    </w:p>
+    <w:p>
+      <w:pPr>
+        <w:pStyle w:val="ListParagraph"/>
+        <w:spacing w:after="0"/>
+        <w:ind w:left="1440"/>
+        <w:rPr>
+          <w:b/>
+          <w:bCs/>
+        </w:rPr>
+      </w:pPr>
+      <w:r>
+        <w:rPr>
+          <w:b/>
+          <w:bCs/>
+        </w:rPr>
+        <w:t>residential bldg. permit by county</w:t>
+      </w:r>
+    </w:p>
+    <w:p>
+      <w:pPr>
+        <w:pStyle w:val="ListParagraph"/>
+        <w:spacing w:after="0"/>
+        <w:ind w:left="1440"/>
+        <w:rPr>
+          <w:b/>
+          <w:bCs/>
+        </w:rPr>
+      </w:pPr>
+      <w:r>
+        <w:rPr>
+          <w:b/>
+          <w:bCs/>
+        </w:rPr>
+        <w:t>snap enrollment by county</w:t>
+      </w:r>
+    </w:p>
+    <w:p>
+      <w:pPr>
+        <w:pStyle w:val="ListParagraph"/>
+        <w:spacing w:after="0"/>
+        <w:ind w:left="1440"/>
+        <w:rPr>
+          <w:b/>
+          <w:bCs/>
+        </w:rPr>
+      </w:pPr>
+      <w:r>
+        <w:rPr>
+          <w:b/>
+          <w:bCs/>
+        </w:rPr>
+        <w:t>bank branch density</w:t>
+      </w:r>
+    </w:p>
+    <w:p>
+      <w:pPr>
+        <w:pStyle w:val="ListParagraph"/>
+        <w:spacing w:after="0"/>
+        <w:ind w:left="1440"/>
+        <w:rPr>
+          <w:b/>
+          <w:bCs/>
+        </w:rPr>
+      </w:pPr>
+      <w:r>
+        <w:rPr>
+          <w:b/>
+          <w:bCs/>
+        </w:rPr>
+        <w:t>NOAA likely storm damage</w:t>
+      </w:r>
+    </w:p>
+    <w:p>
+      <w:pPr>
+        <w:pStyle w:val="ListParagraph"/>
         <w:numPr>
           <w:ilvl w:val="0"/>
           <w:numId w:val="1"/>
@@ -489,6 +640,7 @@
         <w:t xml:space="preserve"> for hours, I couldn’t find </w:t>
       </w:r>
       <w:r>
+        <w:lastRenderedPageBreak/>
         <w:t xml:space="preserve">datasets for previous years. </w:t>
       </w:r>
       <w:r>
@@ -604,7 +756,6 @@
         <w:spacing w:after="0"/>
       </w:pPr>
       <w:r>
-        <w:lastRenderedPageBreak/>
         <w:t>Will a group member need to be assigned to missing data?</w:t>
       </w:r>
     </w:p>

</xml_diff>

<commit_message>
Beginning of question 10
added zip_fips.csv
started section
</commit_message>
<xml_diff>
--- a/AssignmentNotes.docx
+++ b/AssignmentNotes.docx
@@ -73,7 +73,7 @@
         <w:pStyle w:val="ListParagraph"/>
         <w:numPr>
           <w:ilvl w:val="0"/>
-          <w:numId w:val="1"/>
+          <w:numId w:val="4"/>
         </w:numPr>
         <w:spacing w:after="0"/>
         <w:rPr>
@@ -92,7 +92,7 @@
         <w:pStyle w:val="ListParagraph"/>
         <w:numPr>
           <w:ilvl w:val="0"/>
-          <w:numId w:val="1"/>
+          <w:numId w:val="4"/>
         </w:numPr>
         <w:spacing w:after="0"/>
         <w:rPr>
@@ -123,7 +123,7 @@
         <w:pStyle w:val="ListParagraph"/>
         <w:numPr>
           <w:ilvl w:val="0"/>
-          <w:numId w:val="1"/>
+          <w:numId w:val="4"/>
         </w:numPr>
         <w:spacing w:after="0"/>
         <w:rPr>
@@ -154,7 +154,7 @@
         <w:pStyle w:val="ListParagraph"/>
         <w:numPr>
           <w:ilvl w:val="0"/>
-          <w:numId w:val="1"/>
+          <w:numId w:val="4"/>
         </w:numPr>
         <w:spacing w:after="0"/>
         <w:rPr>
@@ -173,7 +173,7 @@
         <w:pStyle w:val="ListParagraph"/>
         <w:numPr>
           <w:ilvl w:val="0"/>
-          <w:numId w:val="1"/>
+          <w:numId w:val="4"/>
         </w:numPr>
         <w:spacing w:after="0"/>
         <w:rPr>
@@ -192,7 +192,7 @@
         <w:pStyle w:val="ListParagraph"/>
         <w:numPr>
           <w:ilvl w:val="0"/>
-          <w:numId w:val="1"/>
+          <w:numId w:val="4"/>
         </w:numPr>
         <w:spacing w:after="0"/>
         <w:rPr>
@@ -211,7 +211,7 @@
         <w:pStyle w:val="ListParagraph"/>
         <w:numPr>
           <w:ilvl w:val="0"/>
-          <w:numId w:val="1"/>
+          <w:numId w:val="4"/>
         </w:numPr>
         <w:spacing w:after="0"/>
         <w:rPr>
@@ -230,7 +230,7 @@
         <w:pStyle w:val="ListParagraph"/>
         <w:numPr>
           <w:ilvl w:val="0"/>
-          <w:numId w:val="1"/>
+          <w:numId w:val="4"/>
         </w:numPr>
         <w:spacing w:after="0"/>
         <w:rPr>
@@ -400,7 +400,7 @@
         <w:pStyle w:val="ListParagraph"/>
         <w:numPr>
           <w:ilvl w:val="0"/>
-          <w:numId w:val="1"/>
+          <w:numId w:val="4"/>
         </w:numPr>
         <w:spacing w:after="0"/>
         <w:rPr>
@@ -419,7 +419,7 @@
         <w:pStyle w:val="ListParagraph"/>
         <w:numPr>
           <w:ilvl w:val="0"/>
-          <w:numId w:val="1"/>
+          <w:numId w:val="4"/>
         </w:numPr>
         <w:spacing w:after="0"/>
         <w:rPr>
@@ -438,7 +438,7 @@
         <w:pStyle w:val="ListParagraph"/>
         <w:numPr>
           <w:ilvl w:val="0"/>
-          <w:numId w:val="1"/>
+          <w:numId w:val="4"/>
         </w:numPr>
         <w:spacing w:after="0"/>
         <w:rPr>
@@ -457,7 +457,7 @@
         <w:pStyle w:val="ListParagraph"/>
         <w:numPr>
           <w:ilvl w:val="0"/>
-          <w:numId w:val="1"/>
+          <w:numId w:val="4"/>
         </w:numPr>
         <w:spacing w:after="0"/>
         <w:rPr>
@@ -476,7 +476,7 @@
         <w:pStyle w:val="ListParagraph"/>
         <w:numPr>
           <w:ilvl w:val="0"/>
-          <w:numId w:val="1"/>
+          <w:numId w:val="4"/>
         </w:numPr>
         <w:spacing w:after="0"/>
         <w:rPr>
@@ -495,7 +495,7 @@
         <w:pStyle w:val="ListParagraph"/>
         <w:numPr>
           <w:ilvl w:val="0"/>
-          <w:numId w:val="1"/>
+          <w:numId w:val="4"/>
         </w:numPr>
         <w:spacing w:after="0"/>
         <w:rPr>
@@ -514,7 +514,7 @@
         <w:pStyle w:val="ListParagraph"/>
         <w:numPr>
           <w:ilvl w:val="0"/>
-          <w:numId w:val="1"/>
+          <w:numId w:val="4"/>
         </w:numPr>
         <w:spacing w:after="0"/>
         <w:rPr>
@@ -533,7 +533,7 @@
         <w:pStyle w:val="ListParagraph"/>
         <w:numPr>
           <w:ilvl w:val="0"/>
-          <w:numId w:val="1"/>
+          <w:numId w:val="4"/>
         </w:numPr>
         <w:spacing w:after="0"/>
         <w:rPr>
@@ -556,13 +556,11 @@
     <w:p>
       <w:pPr>
         <w:spacing w:after="0"/>
-        <w:ind w:left="360"/>
-      </w:pPr>
-    </w:p>
-    <w:p>
-      <w:pPr>
-        <w:spacing w:after="0"/>
-        <w:ind w:left="360"/>
+      </w:pPr>
+    </w:p>
+    <w:p>
+      <w:pPr>
+        <w:spacing w:after="0"/>
       </w:pPr>
       <w:r>
         <w:t>Questions for Tony</w:t>
@@ -582,81 +580,98 @@
       </w:r>
     </w:p>
     <w:p>
-      <w:pPr>
-        <w:pStyle w:val="ListParagraph"/>
-        <w:numPr>
-          <w:ilvl w:val="0"/>
-          <w:numId w:val="2"/>
-        </w:numPr>
-        <w:spacing w:after="0"/>
-      </w:pPr>
-      <w:r>
-        <w:t xml:space="preserve">Most of the data </w:t>
-      </w:r>
-      <w:r>
-        <w:t>from sections 4-7 have years that don’t completely overlap the CFPB data</w:t>
-      </w:r>
-      <w:r>
-        <w:t>. I</w:t>
-      </w:r>
-      <w:r>
-        <w:t xml:space="preserve">s this another exercise in imputation, or is it acceptable to drop </w:t>
-      </w:r>
-      <w:r>
-        <w:t>newer/older observations?</w:t>
-      </w:r>
-    </w:p>
-    <w:p>
-      <w:pPr>
-        <w:pStyle w:val="ListParagraph"/>
-        <w:numPr>
-          <w:ilvl w:val="0"/>
-          <w:numId w:val="2"/>
-        </w:numPr>
-        <w:spacing w:after="0"/>
-      </w:pPr>
-      <w:r>
-        <w:t>In section 6, the</w:t>
-      </w:r>
-      <w:r>
-        <w:t xml:space="preserve"> </w:t>
-      </w:r>
-      <w:r>
-        <w:t xml:space="preserve">demographic </w:t>
-      </w:r>
-      <w:r>
-        <w:t>data are taken from a mix of sources and years</w:t>
-      </w:r>
-      <w:r>
-        <w:t>, while the debt-based data are revised annually.</w:t>
-      </w:r>
-      <w:r>
-        <w:t xml:space="preserve"> </w:t>
-      </w:r>
-      <w:r>
-        <w:t>After digging</w:t>
-      </w:r>
-      <w:r>
-        <w:t xml:space="preserve"> for hours, I couldn’t find </w:t>
-      </w:r>
-      <w:r>
-        <w:lastRenderedPageBreak/>
-        <w:t xml:space="preserve">datasets for previous years. </w:t>
-      </w:r>
-      <w:r>
-        <w:t xml:space="preserve">Is it safe to take these values as relatively </w:t>
-      </w:r>
-      <w:r>
-        <w:t xml:space="preserve">stable over the 2022-2025 period? In other words, can we join the data on the FIPS code </w:t>
-      </w:r>
-      <w:r>
-        <w:t>ignoring the date</w:t>
-      </w:r>
-      <w:r>
-        <w:t>, or is this another imputation problem</w:t>
-      </w:r>
-      <w:r>
-        <w:t>?</w:t>
+      <w:r>
+        <w:t>A</w:t>
+      </w:r>
+      <w:r>
+        <w:t>nswers in Class</w:t>
+      </w:r>
+      <w:r>
+        <w:t xml:space="preserve">: </w:t>
+      </w:r>
+    </w:p>
+    <w:p>
+      <w:pPr>
+        <w:numPr>
+          <w:ilvl w:val="1"/>
+          <w:numId w:val="1"/>
+        </w:numPr>
+        <w:spacing w:after="0" w:line="276" w:lineRule="auto"/>
+      </w:pPr>
+      <w:r>
+        <w:t xml:space="preserve">We are allowed to use AI to categorize the analysis </w:t>
+      </w:r>
+    </w:p>
+    <w:p>
+      <w:pPr>
+        <w:numPr>
+          <w:ilvl w:val="1"/>
+          <w:numId w:val="1"/>
+        </w:numPr>
+        <w:spacing w:after="0" w:line="276" w:lineRule="auto"/>
+      </w:pPr>
+      <w:r>
+        <w:t>Dates dont line up, dont worry about that in terms of the county level stuff</w:t>
+      </w:r>
+    </w:p>
+    <w:p>
+      <w:pPr>
+        <w:numPr>
+          <w:ilvl w:val="1"/>
+          <w:numId w:val="1"/>
+        </w:numPr>
+        <w:spacing w:after="0" w:line="276" w:lineRule="auto"/>
+      </w:pPr>
+      <w:r>
+        <w:t>If we want to do an interpolation and interpret what it would be for the missing year we can do that but it is not needed for this class</w:t>
+      </w:r>
+    </w:p>
+    <w:p>
+      <w:pPr>
+        <w:numPr>
+          <w:ilvl w:val="1"/>
+          <w:numId w:val="1"/>
+        </w:numPr>
+        <w:spacing w:after="0" w:line="276" w:lineRule="auto"/>
+      </w:pPr>
+      <w:r>
+        <w:t>Especially for census data, yr to yr sampling error is bigger than the percent change</w:t>
+      </w:r>
+    </w:p>
+    <w:p>
+      <w:pPr>
+        <w:numPr>
+          <w:ilvl w:val="2"/>
+          <w:numId w:val="1"/>
+        </w:numPr>
+        <w:spacing w:after="0" w:line="276" w:lineRule="auto"/>
+      </w:pPr>
+      <w:r>
+        <w:t xml:space="preserve">Census data: dont use 1 year, use 3 year estimates and use them for 10 years so that sampling error is not in the trend </w:t>
+      </w:r>
+    </w:p>
+    <w:p>
+      <w:pPr>
+        <w:numPr>
+          <w:ilvl w:val="1"/>
+          <w:numId w:val="1"/>
+        </w:numPr>
+        <w:spacing w:after="0" w:line="276" w:lineRule="auto"/>
+      </w:pPr>
+      <w:r>
+        <w:t>Outcome is debt relief, people who had debt and were granted relief on that debt</w:t>
+      </w:r>
+    </w:p>
+    <w:p>
+      <w:pPr>
+        <w:numPr>
+          <w:ilvl w:val="2"/>
+          <w:numId w:val="1"/>
+        </w:numPr>
+        <w:spacing w:after="0" w:line="276" w:lineRule="auto"/>
+      </w:pPr>
+      <w:r>
+        <w:t>Who is going to try and fix their credit rating</w:t>
       </w:r>
     </w:p>
     <w:p>
@@ -694,87 +709,7 @@
         <w:spacing w:after="0"/>
       </w:pPr>
       <w:r>
-        <w:t>Massive feature growth</w:t>
-      </w:r>
-      <w:r>
-        <w:t xml:space="preserve">. Dimension reduction is </w:t>
-      </w:r>
-      <w:r>
-        <w:t>the first concern</w:t>
-      </w:r>
-    </w:p>
-    <w:p>
-      <w:pPr>
-        <w:pStyle w:val="ListParagraph"/>
-        <w:numPr>
-          <w:ilvl w:val="0"/>
-          <w:numId w:val="3"/>
-        </w:numPr>
-        <w:spacing w:after="0"/>
-      </w:pPr>
-      <w:r>
-        <w:t>Missing data. Zip codes</w:t>
-      </w:r>
-      <w:r>
-        <w:t xml:space="preserve"> need to be </w:t>
-      </w:r>
-      <w:r>
-        <w:t>imputed. S</w:t>
-      </w:r>
-      <w:r>
-        <w:t>ections 4</w:t>
-      </w:r>
-      <w:r>
-        <w:t xml:space="preserve"> &amp;</w:t>
-      </w:r>
-      <w:r>
-        <w:t xml:space="preserve"> 6 </w:t>
-      </w:r>
-      <w:r>
-        <w:t>do not overlap at all with</w:t>
-      </w:r>
-      <w:r>
-        <w:t xml:space="preserve"> 7</w:t>
-      </w:r>
-      <w:r>
-        <w:t xml:space="preserve">, so </w:t>
-      </w:r>
-      <w:r>
-        <w:t xml:space="preserve">every single observation </w:t>
-      </w:r>
-      <w:r>
-        <w:t>will have missing data.</w:t>
-      </w:r>
-    </w:p>
-    <w:p>
-      <w:pPr>
-        <w:pStyle w:val="ListParagraph"/>
-        <w:numPr>
-          <w:ilvl w:val="0"/>
-          <w:numId w:val="3"/>
-        </w:numPr>
-        <w:spacing w:after="0"/>
-      </w:pPr>
-      <w:r>
-        <w:t>Will a group member need to be assigned to missing data?</w:t>
-      </w:r>
-    </w:p>
-    <w:p>
-      <w:pPr>
-        <w:pStyle w:val="ListParagraph"/>
-        <w:numPr>
-          <w:ilvl w:val="0"/>
-          <w:numId w:val="3"/>
-        </w:numPr>
-        <w:spacing w:after="0"/>
-      </w:pPr>
-      <w:proofErr w:type="spellStart"/>
-      <w:r>
-        <w:t>Github</w:t>
-      </w:r>
-      <w:proofErr w:type="spellEnd"/>
-      <w:r>
-        <w:t xml:space="preserve">. Everyone should probably have their own branch. </w:t>
+        <w:t xml:space="preserve">Github. Everyone should probably have their own branch. </w:t>
       </w:r>
       <w:r>
         <w:t>Merging the branches periodically should be a group activity</w:t>
@@ -980,6 +915,119 @@
     </w:lvl>
   </w:abstractNum>
   <w:abstractNum w:abstractNumId="2" w15:restartNumberingAfterBreak="0">
+    <w:nsid w:val="498D62EB"/>
+    <w:multiLevelType w:val="multilevel"/>
+    <w:tmpl w:val="290E4C08"/>
+    <w:lvl w:ilvl="0">
+      <w:start w:val="1"/>
+      <w:numFmt w:val="bullet"/>
+      <w:lvlText w:val="●"/>
+      <w:lvlJc w:val="left"/>
+      <w:pPr>
+        <w:ind w:left="720" w:hanging="360"/>
+      </w:pPr>
+      <w:rPr>
+        <w:u w:val="none"/>
+      </w:rPr>
+    </w:lvl>
+    <w:lvl w:ilvl="1">
+      <w:start w:val="1"/>
+      <w:numFmt w:val="bullet"/>
+      <w:lvlText w:val="○"/>
+      <w:lvlJc w:val="left"/>
+      <w:pPr>
+        <w:ind w:left="1440" w:hanging="360"/>
+      </w:pPr>
+      <w:rPr>
+        <w:u w:val="none"/>
+      </w:rPr>
+    </w:lvl>
+    <w:lvl w:ilvl="2">
+      <w:start w:val="1"/>
+      <w:numFmt w:val="bullet"/>
+      <w:lvlText w:val="■"/>
+      <w:lvlJc w:val="left"/>
+      <w:pPr>
+        <w:ind w:left="2160" w:hanging="360"/>
+      </w:pPr>
+      <w:rPr>
+        <w:u w:val="none"/>
+      </w:rPr>
+    </w:lvl>
+    <w:lvl w:ilvl="3">
+      <w:start w:val="1"/>
+      <w:numFmt w:val="bullet"/>
+      <w:lvlText w:val="●"/>
+      <w:lvlJc w:val="left"/>
+      <w:pPr>
+        <w:ind w:left="2880" w:hanging="360"/>
+      </w:pPr>
+      <w:rPr>
+        <w:u w:val="none"/>
+      </w:rPr>
+    </w:lvl>
+    <w:lvl w:ilvl="4">
+      <w:start w:val="1"/>
+      <w:numFmt w:val="bullet"/>
+      <w:lvlText w:val="○"/>
+      <w:lvlJc w:val="left"/>
+      <w:pPr>
+        <w:ind w:left="3600" w:hanging="360"/>
+      </w:pPr>
+      <w:rPr>
+        <w:u w:val="none"/>
+      </w:rPr>
+    </w:lvl>
+    <w:lvl w:ilvl="5">
+      <w:start w:val="1"/>
+      <w:numFmt w:val="bullet"/>
+      <w:lvlText w:val="■"/>
+      <w:lvlJc w:val="left"/>
+      <w:pPr>
+        <w:ind w:left="4320" w:hanging="360"/>
+      </w:pPr>
+      <w:rPr>
+        <w:u w:val="none"/>
+      </w:rPr>
+    </w:lvl>
+    <w:lvl w:ilvl="6">
+      <w:start w:val="1"/>
+      <w:numFmt w:val="bullet"/>
+      <w:lvlText w:val="●"/>
+      <w:lvlJc w:val="left"/>
+      <w:pPr>
+        <w:ind w:left="5040" w:hanging="360"/>
+      </w:pPr>
+      <w:rPr>
+        <w:u w:val="none"/>
+      </w:rPr>
+    </w:lvl>
+    <w:lvl w:ilvl="7">
+      <w:start w:val="1"/>
+      <w:numFmt w:val="bullet"/>
+      <w:lvlText w:val="○"/>
+      <w:lvlJc w:val="left"/>
+      <w:pPr>
+        <w:ind w:left="5760" w:hanging="360"/>
+      </w:pPr>
+      <w:rPr>
+        <w:u w:val="none"/>
+      </w:rPr>
+    </w:lvl>
+    <w:lvl w:ilvl="8">
+      <w:start w:val="1"/>
+      <w:numFmt w:val="bullet"/>
+      <w:lvlText w:val="■"/>
+      <w:lvlJc w:val="left"/>
+      <w:pPr>
+        <w:ind w:left="6480" w:hanging="360"/>
+      </w:pPr>
+      <w:rPr>
+        <w:u w:val="none"/>
+      </w:rPr>
+    </w:lvl>
+  </w:abstractNum>
+  <w:abstractNum w:abstractNumId="3" w15:restartNumberingAfterBreak="0">
     <w:nsid w:val="4FAF27C0"/>
     <w:multiLevelType w:val="hybridMultilevel"/>
     <w:tmpl w:val="E44CBB3C"/>
@@ -1068,7 +1116,7 @@
       </w:pPr>
     </w:lvl>
   </w:abstractNum>
-  <w:num w:numId="1" w16cid:durableId="301472248">
+  <w:num w:numId="1" w16cid:durableId="1229073017">
     <w:abstractNumId w:val="2"/>
   </w:num>
   <w:num w:numId="2" w16cid:durableId="1581451828">
@@ -1076,6 +1124,9 @@
   </w:num>
   <w:num w:numId="3" w16cid:durableId="2090803356">
     <w:abstractNumId w:val="1"/>
+  </w:num>
+  <w:num w:numId="4" w16cid:durableId="301472248">
+    <w:abstractNumId w:val="3"/>
   </w:num>
 </w:numbering>
 </file>

</xml_diff>

<commit_message>
partial merge with #11
</commit_message>
<xml_diff>
--- a/AssignmentNotes.docx
+++ b/AssignmentNotes.docx
@@ -753,29 +753,140 @@
         <w:pStyle w:val="ListParagraph"/>
         <w:numPr>
           <w:ilvl w:val="0"/>
-          <w:numId w:val="3"/>
-        </w:numPr>
-        <w:spacing w:after="0"/>
-      </w:pPr>
+          <w:numId w:val="5"/>
+        </w:numPr>
+        <w:spacing w:after="0"/>
+      </w:pPr>
+      <w:r>
+        <w:t xml:space="preserve">Missing medical debt data. – probably </w:t>
+      </w:r>
+      <w:proofErr w:type="gramStart"/>
+      <w:r>
+        <w:t>strike :</w:t>
+      </w:r>
+      <w:proofErr w:type="gramEnd"/>
+    </w:p>
+    <w:p>
+      <w:pPr>
+        <w:pStyle w:val="ListParagraph"/>
+        <w:numPr>
+          <w:ilvl w:val="1"/>
+          <w:numId w:val="5"/>
+        </w:numPr>
+        <w:spacing w:after="0"/>
+      </w:pPr>
+      <w:proofErr w:type="gramStart"/>
+      <w:r>
+        <w:t>Median.medical.debt.in.collections.in..2023...</w:t>
+      </w:r>
       <w:proofErr w:type="spellStart"/>
       <w:r>
-        <w:t>Github</w:t>
+        <w:t>Majority.of.Color</w:t>
       </w:r>
       <w:proofErr w:type="spellEnd"/>
-      <w:r>
-        <w:t xml:space="preserve">. Everyone should probably have their own branch. </w:t>
-      </w:r>
-      <w:r>
-        <w:t>Merging the branches periodically should be a group activity</w:t>
-      </w:r>
-      <w:r>
-        <w:t>, which</w:t>
-      </w:r>
-      <w:r>
-        <w:t xml:space="preserve"> will give us a chance to </w:t>
-      </w:r>
-      <w:r>
-        <w:t xml:space="preserve">synthesize our progress. </w:t>
+      <w:proofErr w:type="gramEnd"/>
+      <w:r>
+        <w:t xml:space="preserve"> </w:t>
+      </w:r>
+      <w:r>
+        <w:tab/>
+        <w:t>84%</w:t>
+      </w:r>
+      <w:r>
+        <w:t xml:space="preserve"> </w:t>
+      </w:r>
+    </w:p>
+    <w:p>
+      <w:pPr>
+        <w:pStyle w:val="ListParagraph"/>
+        <w:numPr>
+          <w:ilvl w:val="1"/>
+          <w:numId w:val="5"/>
+        </w:numPr>
+        <w:spacing w:after="0"/>
+      </w:pPr>
+      <w:proofErr w:type="spellStart"/>
+      <w:r>
+        <w:t>Share.with.medical.debt.in.collections</w:t>
+      </w:r>
+      <w:proofErr w:type="spellEnd"/>
+      <w:proofErr w:type="gramStart"/>
+      <w:r>
+        <w:t>...</w:t>
+      </w:r>
+      <w:proofErr w:type="spellStart"/>
+      <w:r>
+        <w:t>Majority.of.Color</w:t>
+      </w:r>
+      <w:proofErr w:type="spellEnd"/>
+      <w:proofErr w:type="gramEnd"/>
+      <w:r>
+        <w:t xml:space="preserve"> </w:t>
+      </w:r>
+      <w:r>
+        <w:tab/>
+        <w:t>77%</w:t>
+      </w:r>
+    </w:p>
+    <w:p>
+      <w:pPr>
+        <w:pStyle w:val="ListParagraph"/>
+        <w:numPr>
+          <w:ilvl w:val="1"/>
+          <w:numId w:val="5"/>
+        </w:numPr>
+        <w:spacing w:after="0"/>
+      </w:pPr>
+      <w:proofErr w:type="gramStart"/>
+      <w:r>
+        <w:t>Median.medical.debt.in.collections.in..</w:t>
+      </w:r>
+      <w:proofErr w:type="gramEnd"/>
+      <w:r>
+        <w:t>2023...</w:t>
+      </w:r>
+      <w:proofErr w:type="spellStart"/>
+      <w:r>
+        <w:t>Majority.White</w:t>
+      </w:r>
+      <w:proofErr w:type="spellEnd"/>
+      <w:r>
+        <w:t xml:space="preserve"> </w:t>
+      </w:r>
+      <w:r>
+        <w:tab/>
+        <w:t>41%</w:t>
+      </w:r>
+      <w:r>
+        <w:t xml:space="preserve"> </w:t>
+      </w:r>
+    </w:p>
+    <w:p>
+      <w:pPr>
+        <w:pStyle w:val="ListParagraph"/>
+        <w:numPr>
+          <w:ilvl w:val="1"/>
+          <w:numId w:val="5"/>
+        </w:numPr>
+        <w:spacing w:after="0"/>
+      </w:pPr>
+      <w:proofErr w:type="gramStart"/>
+      <w:r>
+        <w:t>Median.medical.debt.in.collections.in..</w:t>
+      </w:r>
+      <w:proofErr w:type="gramEnd"/>
+      <w:r>
+        <w:t>2023</w:t>
+      </w:r>
+      <w:r>
+        <w:tab/>
+      </w:r>
+      <w:r>
+        <w:tab/>
+      </w:r>
+      <w:r>
+        <w:tab/>
+        <w:t>35%</w:t>
       </w:r>
     </w:p>
     <w:p>
@@ -783,76 +894,12 @@
         <w:pStyle w:val="ListParagraph"/>
         <w:numPr>
           <w:ilvl w:val="0"/>
-          <w:numId w:val="3"/>
-        </w:numPr>
-        <w:spacing w:after="0"/>
-      </w:pPr>
-      <w:r>
-        <w:t xml:space="preserve">We need to clean up missing data from #7 </w:t>
-      </w:r>
-    </w:p>
-    <w:p>
-      <w:pPr>
-        <w:pStyle w:val="ListParagraph"/>
-        <w:numPr>
-          <w:ilvl w:val="0"/>
-          <w:numId w:val="3"/>
-        </w:numPr>
-        <w:spacing w:after="0"/>
-      </w:pPr>
-      <w:r>
-        <w:t>We need Alan’s work for #4</w:t>
-      </w:r>
-      <w:r>
-        <w:t xml:space="preserve"> and 11</w:t>
-      </w:r>
-      <w:r>
-        <w:t xml:space="preserve">. </w:t>
-      </w:r>
-    </w:p>
-    <w:p>
-      <w:pPr>
-        <w:pStyle w:val="ListParagraph"/>
-        <w:numPr>
-          <w:ilvl w:val="0"/>
-          <w:numId w:val="3"/>
-        </w:numPr>
-        <w:spacing w:after="0"/>
-      </w:pPr>
-      <w:r>
-        <w:t>Daniels uploaded cluster stuff</w:t>
-      </w:r>
-      <w:r>
-        <w:t xml:space="preserve"> random forest</w:t>
-      </w:r>
-    </w:p>
-    <w:p>
-      <w:pPr>
-        <w:pStyle w:val="ListParagraph"/>
-        <w:numPr>
-          <w:ilvl w:val="0"/>
-          <w:numId w:val="3"/>
-        </w:numPr>
-        <w:spacing w:after="0"/>
-      </w:pPr>
-      <w:r>
-        <w:t>Adri copy</w:t>
-      </w:r>
-      <w:r>
-        <w:t xml:space="preserve"> - </w:t>
-      </w:r>
-    </w:p>
-    <w:p>
-      <w:pPr>
-        <w:pStyle w:val="ListParagraph"/>
-        <w:numPr>
-          <w:ilvl w:val="0"/>
-          <w:numId w:val="3"/>
-        </w:numPr>
-        <w:spacing w:after="0"/>
-      </w:pPr>
-      <w:r>
-        <w:t>Matt Mean/median/mode</w:t>
+          <w:numId w:val="5"/>
+        </w:numPr>
+        <w:spacing w:after="0"/>
+      </w:pPr>
+      <w:r>
+        <w:t xml:space="preserve">I used median impute for missing </w:t>
       </w:r>
     </w:p>
     <w:sectPr>
@@ -1247,6 +1294,95 @@
       </w:pPr>
     </w:lvl>
   </w:abstractNum>
+  <w:abstractNum w:abstractNumId="4" w15:restartNumberingAfterBreak="0">
+    <w:nsid w:val="588A7C6B"/>
+    <w:multiLevelType w:val="hybridMultilevel"/>
+    <w:tmpl w:val="B950D042"/>
+    <w:lvl w:ilvl="0" w:tplc="0409000F">
+      <w:start w:val="1"/>
+      <w:numFmt w:val="decimal"/>
+      <w:lvlText w:val="%1."/>
+      <w:lvlJc w:val="left"/>
+      <w:pPr>
+        <w:ind w:left="720" w:hanging="360"/>
+      </w:pPr>
+      <w:rPr>
+        <w:rFonts w:hint="default"/>
+      </w:rPr>
+    </w:lvl>
+    <w:lvl w:ilvl="1" w:tplc="04090019">
+      <w:start w:val="1"/>
+      <w:numFmt w:val="lowerLetter"/>
+      <w:lvlText w:val="%2."/>
+      <w:lvlJc w:val="left"/>
+      <w:pPr>
+        <w:ind w:left="1440" w:hanging="360"/>
+      </w:pPr>
+    </w:lvl>
+    <w:lvl w:ilvl="2" w:tplc="0409001B" w:tentative="1">
+      <w:start w:val="1"/>
+      <w:numFmt w:val="lowerRoman"/>
+      <w:lvlText w:val="%3."/>
+      <w:lvlJc w:val="right"/>
+      <w:pPr>
+        <w:ind w:left="2160" w:hanging="180"/>
+      </w:pPr>
+    </w:lvl>
+    <w:lvl w:ilvl="3" w:tplc="0409000F" w:tentative="1">
+      <w:start w:val="1"/>
+      <w:numFmt w:val="decimal"/>
+      <w:lvlText w:val="%4."/>
+      <w:lvlJc w:val="left"/>
+      <w:pPr>
+        <w:ind w:left="2880" w:hanging="360"/>
+      </w:pPr>
+    </w:lvl>
+    <w:lvl w:ilvl="4" w:tplc="04090019" w:tentative="1">
+      <w:start w:val="1"/>
+      <w:numFmt w:val="lowerLetter"/>
+      <w:lvlText w:val="%5."/>
+      <w:lvlJc w:val="left"/>
+      <w:pPr>
+        <w:ind w:left="3600" w:hanging="360"/>
+      </w:pPr>
+    </w:lvl>
+    <w:lvl w:ilvl="5" w:tplc="0409001B" w:tentative="1">
+      <w:start w:val="1"/>
+      <w:numFmt w:val="lowerRoman"/>
+      <w:lvlText w:val="%6."/>
+      <w:lvlJc w:val="right"/>
+      <w:pPr>
+        <w:ind w:left="4320" w:hanging="180"/>
+      </w:pPr>
+    </w:lvl>
+    <w:lvl w:ilvl="6" w:tplc="0409000F" w:tentative="1">
+      <w:start w:val="1"/>
+      <w:numFmt w:val="decimal"/>
+      <w:lvlText w:val="%7."/>
+      <w:lvlJc w:val="left"/>
+      <w:pPr>
+        <w:ind w:left="5040" w:hanging="360"/>
+      </w:pPr>
+    </w:lvl>
+    <w:lvl w:ilvl="7" w:tplc="04090019" w:tentative="1">
+      <w:start w:val="1"/>
+      <w:numFmt w:val="lowerLetter"/>
+      <w:lvlText w:val="%8."/>
+      <w:lvlJc w:val="left"/>
+      <w:pPr>
+        <w:ind w:left="5760" w:hanging="360"/>
+      </w:pPr>
+    </w:lvl>
+    <w:lvl w:ilvl="8" w:tplc="0409001B" w:tentative="1">
+      <w:start w:val="1"/>
+      <w:numFmt w:val="lowerRoman"/>
+      <w:lvlText w:val="%9."/>
+      <w:lvlJc w:val="right"/>
+      <w:pPr>
+        <w:ind w:left="6480" w:hanging="180"/>
+      </w:pPr>
+    </w:lvl>
+  </w:abstractNum>
   <w:num w:numId="1" w16cid:durableId="1229073017">
     <w:abstractNumId w:val="2"/>
   </w:num>
@@ -1258,6 +1394,9 @@
   </w:num>
   <w:num w:numId="4" w16cid:durableId="301472248">
     <w:abstractNumId w:val="3"/>
+  </w:num>
+  <w:num w:numId="5" w16cid:durableId="559094147">
+    <w:abstractNumId w:val="4"/>
   </w:num>
 </w:numbering>
 </file>

</xml_diff>